<commit_message>
feat: ML+DL+GradCAM 통합 파이프라인 — Streamlit CSV Grad-CAM + PPT 슬라이드 + Word 부록K 추가
</commit_message>
<xml_diff>
--- a/Homework/DL_FactoryAutomation/산출물/허남_딥러닝프로젝트.docx
+++ b/Homework/DL_FactoryAutomation/산출물/허남_딥러닝프로젝트.docx
@@ -6885,6 +6885,712 @@
           <w:sz w:val="18"/>
         </w:rPr>
         <w:t>표 C-1. 개발 환경 및 주요 라이브러리</w:t>
+      </w:r>
+    </w:p>
+    <w:p>
+      <w:r>
+        <w:br w:type="page"/>
+      </w:r>
+    </w:p>
+    <w:p>
+      <w:pPr>
+        <w:pStyle w:val="Heading1"/>
+      </w:pPr>
+      <w:r>
+        <w:rPr>
+          <w:color w:val="1A4A7A"/>
+        </w:rPr>
+        <w:t>부록 K. ML + DL + Grad-CAM 통합 진단 파이프라인</w:t>
+      </w:r>
+    </w:p>
+    <w:p>
+      <w:r>
+        <w:rPr>
+          <w:b w:val="0"/>
+          <w:color w:val="000000"/>
+          <w:sz w:val="22"/>
+        </w:rPr>
+        <w:t>본 프로젝트는 FEMTO-ST 베어링 데이터를 대상으로 머신러닝(ML), 딥러닝(DL), 합성곱 신경망(CNN)과 Gradient-weighted Class Activation Mapping(Grad-CAM)을 결합한 3단계 통합 진단 시스템을 구현하였다.</w:t>
+      </w:r>
+    </w:p>
+    <w:p/>
+    <w:p>
+      <w:pPr>
+        <w:pStyle w:val="Heading2"/>
+      </w:pPr>
+      <w:r>
+        <w:rPr>
+          <w:color w:val="0A6A2A"/>
+        </w:rPr>
+        <w:t>K.1 3단계 파이프라인 개요</w:t>
+      </w:r>
+    </w:p>
+    <w:tbl>
+      <w:tblPr>
+        <w:tblStyle w:val="TableGrid"/>
+        <w:tblW w:type="auto" w:w="0"/>
+        <w:tblLook w:firstColumn="1" w:firstRow="1" w:lastColumn="0" w:lastRow="0" w:noHBand="0" w:noVBand="1" w:val="04A0"/>
+      </w:tblPr>
+      <w:tblGrid>
+        <w:gridCol w:w="3135"/>
+        <w:gridCol w:w="3135"/>
+        <w:gridCol w:w="3135"/>
+      </w:tblGrid>
+      <w:tr>
+        <w:tc>
+          <w:tcPr>
+            <w:tcW w:type="dxa" w:w="3135"/>
+            <w:shd w:val="clear" w:color="auto" w:fill="1A4A7A"/>
+          </w:tcPr>
+          <w:p>
+            <w:pPr>
+              <w:jc w:val="center"/>
+            </w:pPr>
+            <w:r>
+              <w:rPr>
+                <w:b/>
+                <w:color w:val="FFFFFF"/>
+                <w:sz w:val="22"/>
+              </w:rPr>
+              <w:t>단계</w:t>
+            </w:r>
+          </w:p>
+        </w:tc>
+        <w:tc>
+          <w:tcPr>
+            <w:tcW w:type="dxa" w:w="3135"/>
+            <w:shd w:val="clear" w:color="auto" w:fill="1A4A7A"/>
+          </w:tcPr>
+          <w:p>
+            <w:pPr>
+              <w:jc w:val="center"/>
+            </w:pPr>
+            <w:r>
+              <w:rPr>
+                <w:b/>
+                <w:color w:val="FFFFFF"/>
+                <w:sz w:val="22"/>
+              </w:rPr>
+              <w:t>알고리즘</w:t>
+            </w:r>
+          </w:p>
+        </w:tc>
+        <w:tc>
+          <w:tcPr>
+            <w:tcW w:type="dxa" w:w="3135"/>
+            <w:shd w:val="clear" w:color="auto" w:fill="1A4A7A"/>
+          </w:tcPr>
+          <w:p>
+            <w:pPr>
+              <w:jc w:val="center"/>
+            </w:pPr>
+            <w:r>
+              <w:rPr>
+                <w:b/>
+                <w:color w:val="FFFFFF"/>
+                <w:sz w:val="22"/>
+              </w:rPr>
+              <w:t>역할</w:t>
+            </w:r>
+          </w:p>
+        </w:tc>
+      </w:tr>
+      <w:tr>
+        <w:tc>
+          <w:tcPr>
+            <w:tcW w:type="dxa" w:w="3135"/>
+          </w:tcPr>
+          <w:p>
+            <w:r>
+              <w:rPr>
+                <w:sz w:val="20"/>
+              </w:rPr>
+              <w:t>① ML — 정상/열화 분류</w:t>
+            </w:r>
+          </w:p>
+        </w:tc>
+        <w:tc>
+          <w:tcPr>
+            <w:tcW w:type="dxa" w:w="3135"/>
+          </w:tcPr>
+          <w:p>
+            <w:r>
+              <w:rPr>
+                <w:sz w:val="20"/>
+              </w:rPr>
+              <w:t>RandomForest · XGBoost · Logistic Regression</w:t>
+            </w:r>
+          </w:p>
+        </w:tc>
+        <w:tc>
+          <w:tcPr>
+            <w:tcW w:type="dxa" w:w="3135"/>
+          </w:tcPr>
+          <w:p>
+            <w:r>
+              <w:rPr>
+                <w:sz w:val="20"/>
+              </w:rPr>
+              <w:t>진동 피처(RMS·첨도·크레스트) → 열화 확률(%) → 임계값 기반 1차 경보</w:t>
+            </w:r>
+          </w:p>
+        </w:tc>
+      </w:tr>
+      <w:tr>
+        <w:tc>
+          <w:tcPr>
+            <w:tcW w:type="dxa" w:w="3135"/>
+          </w:tcPr>
+          <w:p>
+            <w:r>
+              <w:rPr>
+                <w:sz w:val="20"/>
+              </w:rPr>
+              <w:t>② DL — 잔여수명(RUL) 예측</w:t>
+            </w:r>
+          </w:p>
+        </w:tc>
+        <w:tc>
+          <w:tcPr>
+            <w:tcW w:type="dxa" w:w="3135"/>
+          </w:tcPr>
+          <w:p>
+            <w:r>
+              <w:rPr>
+                <w:sz w:val="20"/>
+              </w:rPr>
+              <w:t>GRU v2 (Batch Normalization + Layer Normalization)</w:t>
+            </w:r>
+          </w:p>
+        </w:tc>
+        <w:tc>
+          <w:tcPr>
+            <w:tcW w:type="dxa" w:w="3135"/>
+          </w:tcPr>
+          <w:p>
+            <w:r>
+              <w:rPr>
+                <w:sz w:val="20"/>
+              </w:rPr>
+              <w:t>시계열 시퀀스 → 잔여 가동 가능 시간(분) 정밀 예측</w:t>
+            </w:r>
+          </w:p>
+        </w:tc>
+      </w:tr>
+      <w:tr>
+        <w:tc>
+          <w:tcPr>
+            <w:tcW w:type="dxa" w:w="3135"/>
+          </w:tcPr>
+          <w:p>
+            <w:r>
+              <w:rPr>
+                <w:sz w:val="20"/>
+              </w:rPr>
+              <w:t>③ CNN + Grad-CAM — 시각화</w:t>
+            </w:r>
+          </w:p>
+        </w:tc>
+        <w:tc>
+          <w:tcPr>
+            <w:tcW w:type="dxa" w:w="3135"/>
+          </w:tcPr>
+          <w:p>
+            <w:r>
+              <w:rPr>
+                <w:sz w:val="20"/>
+              </w:rPr>
+              <w:t>Conv2D × 3 + Grad-CAM</w:t>
+            </w:r>
+          </w:p>
+        </w:tc>
+        <w:tc>
+          <w:tcPr>
+            <w:tcW w:type="dxa" w:w="3135"/>
+          </w:tcPr>
+          <w:p>
+            <w:r>
+              <w:rPr>
+                <w:sz w:val="20"/>
+              </w:rPr>
+              <w:t>진동 신호 → 이미지 변환 → CNN 결함 판정 → 히트맵으로 판정 근거 시각화(XAI)</w:t>
+            </w:r>
+          </w:p>
+        </w:tc>
+      </w:tr>
+    </w:tbl>
+    <w:p/>
+    <w:p>
+      <w:pPr>
+        <w:pStyle w:val="Heading2"/>
+      </w:pPr>
+      <w:r>
+        <w:rPr>
+          <w:color w:val="8B0000"/>
+        </w:rPr>
+        <w:t>K.2 Grad-CAM 원리 및 구현</w:t>
+      </w:r>
+    </w:p>
+    <w:p>
+      <w:r>
+        <w:rPr>
+          <w:b w:val="0"/>
+          <w:color w:val="000000"/>
+          <w:sz w:val="22"/>
+        </w:rPr>
+        <w:t>Grad-CAM(Selvaraju et al., 2017)은 CNN이 특정 클래스를 예측할 때 이미지의 어느 부분을 중요하게 보았는지를 히트맵으로 시각화하는 기법이다. 모델 가중치를 수정하지 않고 기울기(Gradient) 정보만을 활용한다.</w:t>
+      </w:r>
+    </w:p>
+    <w:p/>
+    <w:p>
+      <w:pPr>
+        <w:pStyle w:val="Heading3"/>
+      </w:pPr>
+      <w:r>
+        <w:rPr>
+          <w:color w:val="333333"/>
+        </w:rPr>
+        <w:t>K.2.1 처리 순서</w:t>
+      </w:r>
+    </w:p>
+    <w:p>
+      <w:pPr>
+        <w:pStyle w:val="ListNumber"/>
+      </w:pPr>
+      <w:r>
+        <w:rPr>
+          <w:b/>
+          <w:sz w:val="22"/>
+        </w:rPr>
+        <w:t xml:space="preserve">순전파(Forward Pass): </w:t>
+      </w:r>
+      <w:r>
+        <w:rPr>
+          <w:sz w:val="22"/>
+        </w:rPr>
+        <w:t>입력 이미지 → Conv 레이어 → Feature Map 추출 → GlobalAveragePooling → Dense → 예측 확률 출력</w:t>
+      </w:r>
+    </w:p>
+    <w:p>
+      <w:pPr>
+        <w:pStyle w:val="ListNumber"/>
+      </w:pPr>
+      <w:r>
+        <w:rPr>
+          <w:b/>
+          <w:sz w:val="22"/>
+        </w:rPr>
+        <w:t xml:space="preserve">역전파 기울기 계산: </w:t>
+      </w:r>
+      <w:r>
+        <w:rPr>
+          <w:sz w:val="22"/>
+        </w:rPr>
+        <w:t>예측 점수(클래스 확률)를 기준으로 마지막 Conv 레이어 Feature Map에 대한 기울기(Gradient) 계산</w:t>
+      </w:r>
+    </w:p>
+    <w:p>
+      <w:pPr>
+        <w:pStyle w:val="ListNumber"/>
+      </w:pPr>
+      <w:r>
+        <w:rPr>
+          <w:b/>
+          <w:sz w:val="22"/>
+        </w:rPr>
+        <w:t xml:space="preserve">채널별 중요도 산출: </w:t>
+      </w:r>
+      <w:r>
+        <w:rPr>
+          <w:sz w:val="22"/>
+        </w:rPr>
+        <w:t>각 채널의 기울기를 공간 평균(Global Average Pooling)하여 채널 가중치 α_k 산출</w:t>
+      </w:r>
+    </w:p>
+    <w:p>
+      <w:pPr>
+        <w:pStyle w:val="ListNumber"/>
+      </w:pPr>
+      <w:r>
+        <w:rPr>
+          <w:b/>
+          <w:sz w:val="22"/>
+        </w:rPr>
+        <w:t xml:space="preserve">가중합 + ReLU: </w:t>
+      </w:r>
+      <w:r>
+        <w:rPr>
+          <w:sz w:val="22"/>
+        </w:rPr>
+        <w:t>Feature Map에 채널 가중치를 곱한 뒤 합산 → ReLU 적용 → 예측 클래스에 긍정 영향 영역만 남김</w:t>
+      </w:r>
+    </w:p>
+    <w:p>
+      <w:pPr>
+        <w:pStyle w:val="ListNumber"/>
+      </w:pPr>
+      <w:r>
+        <w:rPr>
+          <w:b/>
+          <w:sz w:val="22"/>
+        </w:rPr>
+        <w:t xml:space="preserve">리사이즈 &amp; 오버레이: </w:t>
+      </w:r>
+      <w:r>
+        <w:rPr>
+          <w:sz w:val="22"/>
+        </w:rPr>
+        <w:t>생성된 히트맵을 원본 이미지 크기로 업샘플링 → jet 컬러맵 적용 → 원본 이미지에 중첩 표시</w:t>
+      </w:r>
+    </w:p>
+    <w:p/>
+    <w:p>
+      <w:pPr>
+        <w:pStyle w:val="Heading2"/>
+      </w:pPr>
+      <w:r>
+        <w:rPr>
+          <w:color w:val="0A6A2A"/>
+        </w:rPr>
+        <w:t>K.3 CSV 진동 데이터 → Grad-CAM 워크플로우</w:t>
+      </w:r>
+    </w:p>
+    <w:p>
+      <w:r>
+        <w:rPr>
+          <w:b w:val="0"/>
+          <w:color w:val="000000"/>
+          <w:sz w:val="22"/>
+        </w:rPr>
+        <w:t>본 시스템은 CSV 형태의 진동 피처 데이터에서도 Grad-CAM을 생성할 수 있도록 다음과 같은 변환 파이프라인을 구현하였다.</w:t>
+      </w:r>
+    </w:p>
+    <w:tbl>
+      <w:tblPr>
+        <w:tblStyle w:val="TableGrid"/>
+        <w:tblW w:type="auto" w:w="0"/>
+        <w:tblLook w:firstColumn="1" w:firstRow="1" w:lastColumn="0" w:lastRow="0" w:noHBand="0" w:noVBand="1" w:val="04A0"/>
+      </w:tblPr>
+      <w:tblGrid>
+        <w:gridCol w:w="3135"/>
+        <w:gridCol w:w="3135"/>
+        <w:gridCol w:w="3135"/>
+      </w:tblGrid>
+      <w:tr>
+        <w:tc>
+          <w:tcPr>
+            <w:tcW w:type="dxa" w:w="3135"/>
+            <w:shd w:val="clear" w:color="auto" w:fill="0A6A2A"/>
+          </w:tcPr>
+          <w:p>
+            <w:pPr>
+              <w:jc w:val="center"/>
+            </w:pPr>
+            <w:r>
+              <w:rPr>
+                <w:b/>
+                <w:color w:val="FFFFFF"/>
+                <w:sz w:val="22"/>
+              </w:rPr>
+              <w:t>단계</w:t>
+            </w:r>
+          </w:p>
+        </w:tc>
+        <w:tc>
+          <w:tcPr>
+            <w:tcW w:type="dxa" w:w="3135"/>
+            <w:shd w:val="clear" w:color="auto" w:fill="0A6A2A"/>
+          </w:tcPr>
+          <w:p>
+            <w:pPr>
+              <w:jc w:val="center"/>
+            </w:pPr>
+            <w:r>
+              <w:rPr>
+                <w:b/>
+                <w:color w:val="FFFFFF"/>
+                <w:sz w:val="22"/>
+              </w:rPr>
+              <w:t>처리 내용</w:t>
+            </w:r>
+          </w:p>
+        </w:tc>
+        <w:tc>
+          <w:tcPr>
+            <w:tcW w:type="dxa" w:w="3135"/>
+            <w:shd w:val="clear" w:color="auto" w:fill="0A6A2A"/>
+          </w:tcPr>
+          <w:p>
+            <w:pPr>
+              <w:jc w:val="center"/>
+            </w:pPr>
+            <w:r>
+              <w:rPr>
+                <w:b/>
+                <w:color w:val="FFFFFF"/>
+                <w:sz w:val="22"/>
+              </w:rPr>
+              <w:t>비고</w:t>
+            </w:r>
+          </w:p>
+        </w:tc>
+      </w:tr>
+      <w:tr>
+        <w:tc>
+          <w:tcPr>
+            <w:tcW w:type="dxa" w:w="3135"/>
+          </w:tcPr>
+          <w:p>
+            <w:r>
+              <w:rPr>
+                <w:sz w:val="20"/>
+              </w:rPr>
+              <w:t>CSV 로드</w:t>
+            </w:r>
+          </w:p>
+        </w:tc>
+        <w:tc>
+          <w:tcPr>
+            <w:tcW w:type="dxa" w:w="3135"/>
+          </w:tcPr>
+          <w:p>
+            <w:r>
+              <w:rPr>
+                <w:sz w:val="20"/>
+              </w:rPr>
+              <w:t>FEMTO 피처 CSV (h_rms, v_rms, minute 등) 읽기</w:t>
+            </w:r>
+          </w:p>
+        </w:tc>
+        <w:tc>
+          <w:tcPr>
+            <w:tcW w:type="dxa" w:w="3135"/>
+          </w:tcPr>
+          <w:p>
+            <w:r>
+              <w:rPr>
+                <w:sz w:val="20"/>
+              </w:rPr>
+              <w:t>Tab4 Sub-tab2</w:t>
+            </w:r>
+          </w:p>
+        </w:tc>
+      </w:tr>
+      <w:tr>
+        <w:tc>
+          <w:tcPr>
+            <w:tcW w:type="dxa" w:w="3135"/>
+          </w:tcPr>
+          <w:p>
+            <w:r>
+              <w:rPr>
+                <w:sz w:val="20"/>
+              </w:rPr>
+              <w:t>ML 일괄 진단</w:t>
+            </w:r>
+          </w:p>
+        </w:tc>
+        <w:tc>
+          <w:tcPr>
+            <w:tcW w:type="dxa" w:w="3135"/>
+          </w:tcPr>
+          <w:p>
+            <w:r>
+              <w:rPr>
+                <w:sz w:val="20"/>
+              </w:rPr>
+              <w:t>RandomForest → 열화 확률(%) 계산 → 결과 테이블</w:t>
+            </w:r>
+          </w:p>
+        </w:tc>
+        <w:tc>
+          <w:tcPr>
+            <w:tcW w:type="dxa" w:w="3135"/>
+          </w:tcPr>
+          <w:p>
+            <w:r>
+              <w:rPr>
+                <w:sz w:val="20"/>
+              </w:rPr>
+              <w:t>임계값 적용</w:t>
+            </w:r>
+          </w:p>
+        </w:tc>
+      </w:tr>
+      <w:tr>
+        <w:tc>
+          <w:tcPr>
+            <w:tcW w:type="dxa" w:w="3135"/>
+          </w:tcPr>
+          <w:p>
+            <w:r>
+              <w:rPr>
+                <w:sz w:val="20"/>
+              </w:rPr>
+              <w:t>최고위험 베어링 선택</w:t>
+            </w:r>
+          </w:p>
+        </w:tc>
+        <w:tc>
+          <w:tcPr>
+            <w:tcW w:type="dxa" w:w="3135"/>
+          </w:tcPr>
+          <w:p>
+            <w:r>
+              <w:rPr>
+                <w:sz w:val="20"/>
+              </w:rPr>
+              <w:t>열화 확률 평균 최고 베어링 자동 선택</w:t>
+            </w:r>
+          </w:p>
+        </w:tc>
+        <w:tc>
+          <w:tcPr>
+            <w:tcW w:type="dxa" w:w="3135"/>
+          </w:tcPr>
+          <w:p>
+            <w:r>
+              <w:rPr>
+                <w:sz w:val="20"/>
+              </w:rPr>
+              <w:t>자동 분석</w:t>
+            </w:r>
+          </w:p>
+        </w:tc>
+      </w:tr>
+      <w:tr>
+        <w:tc>
+          <w:tcPr>
+            <w:tcW w:type="dxa" w:w="3135"/>
+          </w:tcPr>
+          <w:p>
+            <w:r>
+              <w:rPr>
+                <w:sz w:val="20"/>
+              </w:rPr>
+              <w:t>진동 이미지 변환</w:t>
+            </w:r>
+          </w:p>
+        </w:tc>
+        <w:tc>
+          <w:tcPr>
+            <w:tcW w:type="dxa" w:w="3135"/>
+          </w:tcPr>
+          <w:p>
+            <w:r>
+              <w:rPr>
+                <w:sz w:val="20"/>
+              </w:rPr>
+              <w:t>h_rms/v_rms 시계열 → matplotlib 그래프 → PNG 이미지</w:t>
+            </w:r>
+          </w:p>
+        </w:tc>
+        <w:tc>
+          <w:tcPr>
+            <w:tcW w:type="dxa" w:w="3135"/>
+          </w:tcPr>
+          <w:p>
+            <w:r>
+              <w:rPr>
+                <w:sz w:val="20"/>
+              </w:rPr>
+              <w:t>열화=빨강</w:t>
+            </w:r>
+          </w:p>
+        </w:tc>
+      </w:tr>
+      <w:tr>
+        <w:tc>
+          <w:tcPr>
+            <w:tcW w:type="dxa" w:w="3135"/>
+          </w:tcPr>
+          <w:p>
+            <w:r>
+              <w:rPr>
+                <w:sz w:val="20"/>
+              </w:rPr>
+              <w:t>CNN 판정</w:t>
+            </w:r>
+          </w:p>
+        </w:tc>
+        <w:tc>
+          <w:tcPr>
+            <w:tcW w:type="dxa" w:w="3135"/>
+          </w:tcPr>
+          <w:p>
+            <w:r>
+              <w:rPr>
+                <w:sz w:val="20"/>
+              </w:rPr>
+              <w:t>casting_defect_cnn.keras 로드 → 정상/결함 예측</w:t>
+            </w:r>
+          </w:p>
+        </w:tc>
+        <w:tc>
+          <w:tcPr>
+            <w:tcW w:type="dxa" w:w="3135"/>
+          </w:tcPr>
+          <w:p>
+            <w:r>
+              <w:rPr>
+                <w:sz w:val="20"/>
+              </w:rPr>
+              <w:t>val_acc 1.0</w:t>
+            </w:r>
+          </w:p>
+        </w:tc>
+      </w:tr>
+      <w:tr>
+        <w:tc>
+          <w:tcPr>
+            <w:tcW w:type="dxa" w:w="3135"/>
+          </w:tcPr>
+          <w:p>
+            <w:r>
+              <w:rPr>
+                <w:sz w:val="20"/>
+              </w:rPr>
+              <w:t>Grad-CAM 생성</w:t>
+            </w:r>
+          </w:p>
+        </w:tc>
+        <w:tc>
+          <w:tcPr>
+            <w:tcW w:type="dxa" w:w="3135"/>
+          </w:tcPr>
+          <w:p>
+            <w:r>
+              <w:rPr>
+                <w:sz w:val="20"/>
+              </w:rPr>
+              <w:t>마지막 Conv 기울기 → 히트맵 → 원본 오버레이</w:t>
+            </w:r>
+          </w:p>
+        </w:tc>
+        <w:tc>
+          <w:tcPr>
+            <w:tcW w:type="dxa" w:w="3135"/>
+          </w:tcPr>
+          <w:p>
+            <w:r>
+              <w:rPr>
+                <w:sz w:val="20"/>
+              </w:rPr>
+              <w:t>3단 시각화</w:t>
+            </w:r>
+          </w:p>
+        </w:tc>
+      </w:tr>
+    </w:tbl>
+    <w:p/>
+    <w:p>
+      <w:r>
+        <w:rPr>
+          <w:b w:val="0"/>
+          <w:color w:val="555555"/>
+          <w:sz w:val="22"/>
+        </w:rPr>
+        <w:t>※ Grad-CAM 히트맵에서 빨간색(고온) 영역은 CNN이 '결함'으로 판정하는 데 가장 결정적인 시간 구간을 나타내며, 파란색(저온) 영역은 판정에 덜 기여한 구간을 의미한다. 이를 통해 모델의 판정 근거를 시각적으로 해석할 수 있다(Explainable AI, XAI).</w:t>
       </w:r>
     </w:p>
     <w:sectPr>

</xml_diff>